<commit_message>
Amplia Apostila e Slides da Aula 3 para 104 slides
Adiciona exemplos e aprofundamentos por toda a aula (cenarios extras
de debate, exemplos com Biblioteca/Academia, panorama ilustrado dos
diagramas de Estados/Componentes/Objetos/Implantacao com print
visual, PlantUML, atalhos do draw.io, mini-exercicios com gabarito) e
estende a atividade de classificacao de 6 para 8 itens.
</commit_message>
<xml_diff>
--- a/Aula 03 - 11-09-2026/Aula 3 - Apostila do Aluno.docx
+++ b/Aula 03 - 11-09-2026/Aula 3 - Apostila do Aluno.docx
@@ -34,7 +34,7 @@
         <w:rPr>
           <w:sz w:val="21"/>
         </w:rPr>
-        <w:t>Data: 11/09/2026 (sexta-feira)  |  Horário: 07:30 às 11:30 (4h — ritmo acelerado; sem folga)</w:t>
+        <w:t>Data: 11/09/2026 (sexta-feira)  |  Horário: 07:30 às 11:30 (4h — ritmo bem acelerado)</w:t>
       </w:r>
     </w:p>
     <w:p/>
@@ -222,6 +222,74 @@
       <w:pPr/>
       <w:r>
         <w:t>Peguem 1 Requisito Funcional que o grupo escreveu na Aula 2 e escrevam o critério de aceite dele, no formato Dado/Quando/Então (consultem a Apostila da Aula 2, seção 8.2, se precisarem relembrar).</w:t>
+      </w:r>
+    </w:p>
+    <w:p>
+      <w:pPr>
+        <w:pStyle w:val="Ttulo2"/>
+      </w:pPr>
+      <w:r>
+        <w:t>Mais um exemplo de Critério de Aceite</w:t>
+      </w:r>
+    </w:p>
+    <w:p>
+      <w:pPr/>
+      <w:r>
+        <w:t>RF do TechBurger: “se o item selecionado estiver sem estoque, o sistema sugere um substituto” (Regra 6). Dado um item sem estoque selecionado no pedido, Quando o cliente tentar adicioná-lo ao carrinho, Então o sistema deve impedir a adição e sugerir um item substituto do mesmo tipo.</w:t>
+      </w:r>
+    </w:p>
+    <w:p>
+      <w:pPr/>
+      <w:r>
+        <w:t>Reparem: o “Então” tem duas partes (impede + sugere) — as duas precisam estar no critério, senão ele fica incompleto.</w:t>
+      </w:r>
+    </w:p>
+    <w:p>
+      <w:pPr>
+        <w:pStyle w:val="Ttulo2"/>
+      </w:pPr>
+      <w:r>
+        <w:t>Erros comuns ao escrever critérios de aceite</w:t>
+      </w:r>
+    </w:p>
+    <w:p>
+      <w:pPr>
+        <w:pStyle w:val="Commarcadores"/>
+      </w:pPr>
+      <w:r>
+        <w:t>Critério vago — “o sistema deve funcionar direito” não dá pra testar.</w:t>
+      </w:r>
+    </w:p>
+    <w:p>
+      <w:pPr>
+        <w:pStyle w:val="Commarcadores"/>
+      </w:pPr>
+      <w:r>
+        <w:t>Critério que só repete o RF, sem detalhar o resultado esperado.</w:t>
+      </w:r>
+    </w:p>
+    <w:p>
+      <w:pPr>
+        <w:pStyle w:val="Commarcadores"/>
+      </w:pPr>
+      <w:r>
+        <w:t>Critério que testa duas coisas ao mesmo tempo, sem deixar claro qual delas falhou.</w:t>
+      </w:r>
+    </w:p>
+    <w:p>
+      <w:pPr>
+        <w:pStyle w:val="Commarcadores"/>
+      </w:pPr>
+      <w:r>
+        <w:t>Esquecer o “Dado” — sem contexto inicial, não dá pra saber quando o critério se aplica.</w:t>
+      </w:r>
+    </w:p>
+    <w:p>
+      <w:pPr>
+        <w:pStyle w:val="Commarcadores"/>
+      </w:pPr>
+      <w:r>
+        <w:t>Regra prática: se dois colegas testarem o mesmo critério e chegarem a resultados diferentes, ele não está bom o suficiente.</w:t>
       </w:r>
     </w:p>
     <w:p>
@@ -413,6 +481,12 @@
       </w:r>
     </w:p>
     <w:p>
+      <w:pPr/>
+      <w:r>
+        <w:t>Mais um exemplo, agora com a Biblioteca: a regra “Ler Mais” (um associado só pode pegar um livro novo com menos de 3 emprestados) tem uma ambiguidade real — “emprestados” conta os livros atrasados também, ou só os dentro do prazo? Pega essa dúvida no levantamento de requisitos: custo 1x, só perguntar e documentar a resposta. Só percebe na codificação: custo 10x. Só aparece com o sistema no ar, associado reclamando que não conseguiu pegar um livro que deveria poder pegar: custo 100x+.</w:t>
+      </w:r>
+    </w:p>
+    <w:p>
       <w:pPr>
         <w:pStyle w:val="Ttulo2"/>
       </w:pPr>
@@ -431,6 +505,26 @@
         <w:pStyle w:val="Ttulo2"/>
       </w:pPr>
       <w:r>
+        <w:t>Debate: E se não tivéssemos UML?</w:t>
+      </w:r>
+    </w:p>
+    <w:p>
+      <w:pPr/>
+      <w:r>
+        <w:t>Imaginem: cada empresa, cada time, cada dev com sua própria notação de diagrama. Um dev sai do time — o próximo não entende os diagramas que ele deixou. Uma consultoria externa entra no projeto — precisa aprender a notação do zero. Isso é literalmente o cenário pré-1997, antes da unificação.</w:t>
+      </w:r>
+    </w:p>
+    <w:p>
+      <w:pPr/>
+      <w:r>
+        <w:t>Debate rápido: que outros problemas um “cada um com seu jeito” causaria num time de verdade?</w:t>
+      </w:r>
+    </w:p>
+    <w:p>
+      <w:pPr>
+        <w:pStyle w:val="Ttulo2"/>
+      </w:pPr>
+      <w:r>
         <w:t>1.3 UML no mercado: só o necessário</w:t>
       </w:r>
     </w:p>
@@ -459,6 +553,94 @@
         <w:pStyle w:val="Ttulo2"/>
       </w:pPr>
       <w:r>
+        <w:t>1.3.1 UML no mercado: exemplos reais</w:t>
+      </w:r>
+    </w:p>
+    <w:p>
+      <w:pPr>
+        <w:pStyle w:val="Commarcadores"/>
+      </w:pPr>
+      <w:r>
+        <w:t>Vagas de Analista de Sistemas e Arquiteto de Software costumam pedir “leitura de diagramas UML” como requisito.</w:t>
+      </w:r>
+    </w:p>
+    <w:p>
+      <w:pPr>
+        <w:pStyle w:val="Commarcadores"/>
+      </w:pPr>
+      <w:r>
+        <w:t>Ferramentas como Jira, Confluence e Azure DevOps permitem anexar diagramas UML direto nas histórias e épicos.</w:t>
+      </w:r>
+    </w:p>
+    <w:p>
+      <w:pPr>
+        <w:pStyle w:val="Commarcadores"/>
+      </w:pPr>
+      <w:r>
+        <w:t>Times que praticam Domain-Driven Design (DDD) desenham Diagramas de Classes pra alinhar o modelo de domínio antes de codificar.</w:t>
+      </w:r>
+    </w:p>
+    <w:p>
+      <w:pPr>
+        <w:pStyle w:val="Commarcadores"/>
+      </w:pPr>
+      <w:r>
+        <w:t>Mesmo sem “UML formal”, ferramentas como Miro e Excalidraw reaproveitam a mesma notação — o padrão sobrevive, só muda o formato do arquivo.</w:t>
+      </w:r>
+    </w:p>
+    <w:p>
+      <w:pPr>
+        <w:pStyle w:val="Ttulo2"/>
+      </w:pPr>
+      <w:r>
+        <w:t>1.3.2 Quem usa modelagem no dia a dia</w:t>
+      </w:r>
+    </w:p>
+    <w:p>
+      <w:pPr>
+        <w:pStyle w:val="Commarcadores"/>
+      </w:pPr>
+      <w:r>
+        <w:t>Analista de Requisitos — desenha Casos de Uso pra alinhar escopo com o cliente.</w:t>
+      </w:r>
+    </w:p>
+    <w:p>
+      <w:pPr>
+        <w:pStyle w:val="Commarcadores"/>
+      </w:pPr>
+      <w:r>
+        <w:t>Arquiteto de Software — usa Diagrama de Componentes e Implantação pra decidir a estrutura do sistema.</w:t>
+      </w:r>
+    </w:p>
+    <w:p>
+      <w:pPr>
+        <w:pStyle w:val="Commarcadores"/>
+      </w:pPr>
+      <w:r>
+        <w:t>Product Owner — lê (não desenha) diagramas pra entender o que o time está construindo.</w:t>
+      </w:r>
+    </w:p>
+    <w:p>
+      <w:pPr>
+        <w:pStyle w:val="Commarcadores"/>
+      </w:pPr>
+      <w:r>
+        <w:t>QA / Testador — usa Diagrama de Atividades e critérios de aceite pra planejar casos de teste.</w:t>
+      </w:r>
+    </w:p>
+    <w:p>
+      <w:pPr>
+        <w:pStyle w:val="Commarcadores"/>
+      </w:pPr>
+      <w:r>
+        <w:t>Nem todo papel desenha diagrama — mas quase todo papel técnico precisa ler um.</w:t>
+      </w:r>
+    </w:p>
+    <w:p>
+      <w:pPr>
+        <w:pStyle w:val="Ttulo2"/>
+      </w:pPr>
+      <w:r>
         <w:t>1.4 UML 1.x → 2.x: o que mudou</w:t>
       </w:r>
     </w:p>
@@ -527,6 +709,14 @@
       </w:r>
     </w:p>
     <w:p>
+      <w:pPr>
+        <w:pStyle w:val="Commarcadores"/>
+      </w:pPr>
+      <w:r>
+        <w:t>Cenário D — Sistema de saúde: prontuário eletrônico com dados sensíveis (LGPD), integração com outros hospitais e laboratórios — aqui o risco de um erro não é só financeiro, pode afetar a saúde de alguém.</w:t>
+      </w:r>
+    </w:p>
+    <w:p>
       <w:pPr/>
       <w:r>
         <w:t>Para cada cenário, debatam: vocês modelariam tudo em UML antes de codificar, ou só o essencial? Quais diagramas (se algum) vocês fariam?</w:t>
@@ -619,6 +809,46 @@
         <w:pStyle w:val="Ttulo2"/>
       </w:pPr>
       <w:r>
+        <w:t>Como reconhecer um modelo ruim</w:t>
+      </w:r>
+    </w:p>
+    <w:p>
+      <w:pPr>
+        <w:pStyle w:val="Commarcadores"/>
+      </w:pPr>
+      <w:r>
+        <w:t>Diagrama de Classes com 40 atributos numa única classe — ninguém consegue ler de relance.</w:t>
+      </w:r>
+    </w:p>
+    <w:p>
+      <w:pPr>
+        <w:pStyle w:val="Commarcadores"/>
+      </w:pPr>
+      <w:r>
+        <w:t>Nomes genéricos: classe “Coisa1”, atributo “dado2” — não comunicam nada sobre o sistema real.</w:t>
+      </w:r>
+    </w:p>
+    <w:p>
+      <w:pPr>
+        <w:pStyle w:val="Commarcadores"/>
+      </w:pPr>
+      <w:r>
+        <w:t>Relações sem multiplicidade: não dá pra saber se é “1 pra 1” ou “1 pra muitos”.</w:t>
+      </w:r>
+    </w:p>
+    <w:p>
+      <w:pPr>
+        <w:pStyle w:val="Commarcadores"/>
+      </w:pPr>
+      <w:r>
+        <w:t>Se vocês olharem um diagrama e não conseguirem explicar o que ele representa em 10 segundos, ele provavelmente viola alguma das características da seção anterior.</w:t>
+      </w:r>
+    </w:p>
+    <w:p>
+      <w:pPr>
+        <w:pStyle w:val="Ttulo2"/>
+      </w:pPr>
+      <w:r>
         <w:t>2.4 Estrutural x Comportamental: um exemplo lado a lado</w:t>
       </w:r>
     </w:p>
@@ -635,6 +865,12 @@
       </w:r>
     </w:p>
     <w:p>
+      <w:pPr/>
+      <w:r>
+        <w:t>Mais um par de olhares, com a Biblioteca “Ler Mais”: como estrutura, ela envolve um Aluno, um Livro e um Empréstimo — um Aluno pode ter vários Empréstimos ativos. Como comportamento, é uma sequência: o aluno pede um livro, o sistema verifica o limite de 3, e confirma ou recusa o empréstimo.</w:t>
+      </w:r>
+    </w:p>
+    <w:p>
       <w:pPr>
         <w:pStyle w:val="Ttulo2"/>
       </w:pPr>
@@ -646,6 +882,20 @@
       <w:pPr/>
       <w:r>
         <w:t>Pense na planta de um prédio: a planta baixa mostra os cômodos e paredes, a planta elétrica mostra os fios e tomadas, e a planta hidráulica mostra os canos — todas descrevem o mesmo prédio, mas cada uma foca em um aspecto diferente, para um público diferente (o pedreiro usa uma, o eletricista usa outra). A UML funciona do mesmo jeito: cada diagrama é uma “planta” diferente do mesmo sistema, e nenhum diagrama sozinho conta a história inteira.</w:t>
+      </w:r>
+    </w:p>
+    <w:p>
+      <w:pPr>
+        <w:pStyle w:val="Ttulo2"/>
+      </w:pPr>
+      <w:r>
+        <w:t>Analogia: GPS e a UML</w:t>
+      </w:r>
+    </w:p>
+    <w:p>
+      <w:pPr/>
+      <w:r>
+        <w:t>Um GPS mostra o mesmo trajeto de formas diferentes: vista de satélite, vista de ruas, vista de trânsito em tempo real. Nenhuma vista sozinha é “a errada” — cada uma serve pra uma decisão diferente. A UML funciona igual: Casos de Uso, Classes, Atividades e Sequência são “vistas” diferentes do mesmo sistema. Escolher o diagrama certo é escolher a vista certa pra pergunta que vocês têm agora.</w:t>
       </w:r>
     </w:p>
     <w:p>
@@ -995,6 +1245,286 @@
         <w:pStyle w:val="Ttulo2"/>
       </w:pPr>
       <w:r>
+        <w:t>3.2.1 Panorama: mais quatro diagramas (de reconhecimento)</w:t>
+      </w:r>
+    </w:p>
+    <w:p>
+      <w:pPr/>
+      <w:r>
+        <w:t>Diagrama de Estados</w:t>
+      </w:r>
+    </w:p>
+    <w:p>
+      <w:pPr/>
+      <w:r>
+        <w:t>Mostra os estados possíveis de um objeto e o que dispara a mudança de um pro outro. Útil pra regras com “status”: pedido Pendente → Pago → Em preparo → Pronto. Não é foco desta disciplina, mas aparece bastante em sistemas de workflow.</w:t>
+      </w:r>
+    </w:p>
+    <w:p>
+      <w:pPr>
+        <w:jc w:val="center"/>
+      </w:pPr>
+      <w:r>
+        <w:drawing>
+          <wp:inline xmlns:a="http://schemas.openxmlformats.org/drawingml/2006/main" xmlns:pic="http://schemas.openxmlformats.org/drawingml/2006/picture">
+            <wp:extent cx="4114800" cy="1920240"/>
+            <wp:docPr id="3" name="Picture 3"/>
+            <wp:cNvGraphicFramePr>
+              <a:graphicFrameLocks noChangeAspect="1"/>
+            </wp:cNvGraphicFramePr>
+            <a:graphic>
+              <a:graphicData uri="http://schemas.openxmlformats.org/drawingml/2006/picture">
+                <pic:pic>
+                  <pic:nvPicPr>
+                    <pic:cNvPr id="0" name="diagrama_estados.png"/>
+                    <pic:cNvPicPr/>
+                  </pic:nvPicPr>
+                  <pic:blipFill>
+                    <a:blip r:embed="rId10"/>
+                    <a:stretch>
+                      <a:fillRect/>
+                    </a:stretch>
+                  </pic:blipFill>
+                  <pic:spPr>
+                    <a:xfrm>
+                      <a:off x="0" y="0"/>
+                      <a:ext cx="4114800" cy="1920240"/>
+                    </a:xfrm>
+                    <a:prstGeom prst="rect"/>
+                  </pic:spPr>
+                </pic:pic>
+              </a:graphicData>
+            </a:graphic>
+          </wp:inline>
+        </w:drawing>
+      </w:r>
+    </w:p>
+    <w:p>
+      <w:pPr>
+        <w:pStyle w:val="Legenda"/>
+        <w:jc w:val="center"/>
+      </w:pPr>
+      <w:r>
+        <w:t>Exemplo: Diagrama de Estados do Pedido do TechBurger.</w:t>
+      </w:r>
+    </w:p>
+    <w:p>
+      <w:pPr/>
+      <w:r>
+        <w:t>Diagrama de Componentes</w:t>
+      </w:r>
+    </w:p>
+    <w:p>
+      <w:pPr/>
+      <w:r>
+        <w:t>Mostra como o sistema se divide em partes que se comunicam (ex.: API, banco de dados, app mobile). Ajuda a enxergar a arquitetura de fora, sem entrar no código.</w:t>
+      </w:r>
+    </w:p>
+    <w:p>
+      <w:pPr>
+        <w:jc w:val="center"/>
+      </w:pPr>
+      <w:r>
+        <w:drawing>
+          <wp:inline xmlns:a="http://schemas.openxmlformats.org/drawingml/2006/main" xmlns:pic="http://schemas.openxmlformats.org/drawingml/2006/picture">
+            <wp:extent cx="4114800" cy="1920240"/>
+            <wp:docPr id="4" name="Picture 4"/>
+            <wp:cNvGraphicFramePr>
+              <a:graphicFrameLocks noChangeAspect="1"/>
+            </wp:cNvGraphicFramePr>
+            <a:graphic>
+              <a:graphicData uri="http://schemas.openxmlformats.org/drawingml/2006/picture">
+                <pic:pic>
+                  <pic:nvPicPr>
+                    <pic:cNvPr id="0" name="diagrama_componentes.png"/>
+                    <pic:cNvPicPr/>
+                  </pic:nvPicPr>
+                  <pic:blipFill>
+                    <a:blip r:embed="rId11"/>
+                    <a:stretch>
+                      <a:fillRect/>
+                    </a:stretch>
+                  </pic:blipFill>
+                  <pic:spPr>
+                    <a:xfrm>
+                      <a:off x="0" y="0"/>
+                      <a:ext cx="4114800" cy="1920240"/>
+                    </a:xfrm>
+                    <a:prstGeom prst="rect"/>
+                  </pic:spPr>
+                </pic:pic>
+              </a:graphicData>
+            </a:graphic>
+          </wp:inline>
+        </w:drawing>
+      </w:r>
+    </w:p>
+    <w:p>
+      <w:pPr>
+        <w:pStyle w:val="Legenda"/>
+        <w:jc w:val="center"/>
+      </w:pPr>
+      <w:r>
+        <w:t>Exemplo: Diagrama de Componentes do TechBurger.</w:t>
+      </w:r>
+    </w:p>
+    <w:p>
+      <w:pPr/>
+      <w:r>
+        <w:t>Diagrama de Objetos</w:t>
+      </w:r>
+    </w:p>
+    <w:p>
+      <w:pPr/>
+      <w:r>
+        <w:t>Mostra uma instância específica, já com valores reais preenchidos, num instante do tempo — é como uma “foto”: um Pedido nº 1029, cliente “Maria”, valor R$ 47,90, não o modelo geral.</w:t>
+      </w:r>
+    </w:p>
+    <w:p>
+      <w:pPr>
+        <w:jc w:val="center"/>
+      </w:pPr>
+      <w:r>
+        <w:drawing>
+          <wp:inline xmlns:a="http://schemas.openxmlformats.org/drawingml/2006/main" xmlns:pic="http://schemas.openxmlformats.org/drawingml/2006/picture">
+            <wp:extent cx="4114800" cy="1920240"/>
+            <wp:docPr id="5" name="Picture 5"/>
+            <wp:cNvGraphicFramePr>
+              <a:graphicFrameLocks noChangeAspect="1"/>
+            </wp:cNvGraphicFramePr>
+            <a:graphic>
+              <a:graphicData uri="http://schemas.openxmlformats.org/drawingml/2006/picture">
+                <pic:pic>
+                  <pic:nvPicPr>
+                    <pic:cNvPr id="0" name="diagrama_objetos.png"/>
+                    <pic:cNvPicPr/>
+                  </pic:nvPicPr>
+                  <pic:blipFill>
+                    <a:blip r:embed="rId12"/>
+                    <a:stretch>
+                      <a:fillRect/>
+                    </a:stretch>
+                  </pic:blipFill>
+                  <pic:spPr>
+                    <a:xfrm>
+                      <a:off x="0" y="0"/>
+                      <a:ext cx="4114800" cy="1920240"/>
+                    </a:xfrm>
+                    <a:prstGeom prst="rect"/>
+                  </pic:spPr>
+                </pic:pic>
+              </a:graphicData>
+            </a:graphic>
+          </wp:inline>
+        </w:drawing>
+      </w:r>
+    </w:p>
+    <w:p>
+      <w:pPr>
+        <w:pStyle w:val="Legenda"/>
+        <w:jc w:val="center"/>
+      </w:pPr>
+      <w:r>
+        <w:t>Exemplo: Diagrama de Objetos — uma instância real do Pedido.</w:t>
+      </w:r>
+    </w:p>
+    <w:p>
+      <w:pPr/>
+      <w:r>
+        <w:t>Diagrama de Implantação</w:t>
+      </w:r>
+    </w:p>
+    <w:p>
+      <w:pPr/>
+      <w:r>
+        <w:t>Mostra como as partes do sistema são distribuídas em servidores físicos ou na nuvem — ex.: app no celular, API na nuvem, banco de dados num servidor separado.</w:t>
+      </w:r>
+    </w:p>
+    <w:p>
+      <w:pPr>
+        <w:jc w:val="center"/>
+      </w:pPr>
+      <w:r>
+        <w:drawing>
+          <wp:inline xmlns:a="http://schemas.openxmlformats.org/drawingml/2006/main" xmlns:pic="http://schemas.openxmlformats.org/drawingml/2006/picture">
+            <wp:extent cx="4114800" cy="1920240"/>
+            <wp:docPr id="6" name="Picture 6"/>
+            <wp:cNvGraphicFramePr>
+              <a:graphicFrameLocks noChangeAspect="1"/>
+            </wp:cNvGraphicFramePr>
+            <a:graphic>
+              <a:graphicData uri="http://schemas.openxmlformats.org/drawingml/2006/picture">
+                <pic:pic>
+                  <pic:nvPicPr>
+                    <pic:cNvPr id="0" name="diagrama_implantacao.png"/>
+                    <pic:cNvPicPr/>
+                  </pic:nvPicPr>
+                  <pic:blipFill>
+                    <a:blip r:embed="rId13"/>
+                    <a:stretch>
+                      <a:fillRect/>
+                    </a:stretch>
+                  </pic:blipFill>
+                  <pic:spPr>
+                    <a:xfrm>
+                      <a:off x="0" y="0"/>
+                      <a:ext cx="4114800" cy="1920240"/>
+                    </a:xfrm>
+                    <a:prstGeom prst="rect"/>
+                  </pic:spPr>
+                </pic:pic>
+              </a:graphicData>
+            </a:graphic>
+          </wp:inline>
+        </w:drawing>
+      </w:r>
+    </w:p>
+    <w:p>
+      <w:pPr>
+        <w:pStyle w:val="Legenda"/>
+        <w:jc w:val="center"/>
+      </w:pPr>
+      <w:r>
+        <w:t>Exemplo: Diagrama de Implantação do TechBurger.</w:t>
+      </w:r>
+    </w:p>
+    <w:p>
+      <w:pPr>
+        <w:pStyle w:val="Ttulo2"/>
+      </w:pPr>
+      <w:r>
+        <w:t>Notas de mercado</w:t>
+      </w:r>
+    </w:p>
+    <w:p>
+      <w:pPr>
+        <w:pStyle w:val="Commarcadores"/>
+      </w:pPr>
+      <w:r>
+        <w:t>Cada classe de um Diagrama de Classes costuma virar uma tabela no banco de dados, e cada atributo uma coluna — vocês vão aprofundar isso na disciplina de Banco de Dados (também no Módulo II).</w:t>
+      </w:r>
+    </w:p>
+    <w:p>
+      <w:pPr>
+        <w:pStyle w:val="Commarcadores"/>
+      </w:pPr>
+      <w:r>
+        <w:t>Um quadro Kanban (Trello, Jira) mostra a mesma ideia de um Diagrama de Atividades, mas sem decisões explícitas — o losango de decisão é o que o Kanban simples não tem.</w:t>
+      </w:r>
+    </w:p>
+    <w:p>
+      <w:pPr>
+        <w:pStyle w:val="Commarcadores"/>
+      </w:pPr>
+      <w:r>
+        <w:t>Um RNF como “o sistema deve confirmar o pagamento em até 2 segundos” vira, na prática, um tempo esperado entre duas setas de um Diagrama de Sequência (Aula 8).</w:t>
+      </w:r>
+    </w:p>
+    <w:p>
+      <w:pPr>
+        <w:pStyle w:val="Ttulo2"/>
+      </w:pPr>
+      <w:r>
         <w:t>3.3 Elementos comuns a quase todos os diagramas UML</w:t>
       </w:r>
     </w:p>
@@ -1041,6 +1571,26 @@
         <w:pStyle w:val="Ttulo2"/>
       </w:pPr>
       <w:r>
+        <w:t>Mini-exercício: identifique o ator</w:t>
+      </w:r>
+    </w:p>
+    <w:p>
+      <w:pPr/>
+      <w:r>
+        <w:t>Cenário 1: o Cliente faz login e escolhe os itens pelo app. Cenário 2: o sistema de pagamento externo avisa que a cobrança foi aprovada. Cenário 3: o Atendente cancela um pedido pelo painel da loja. Pra cada cenário: quem (ou o quê) é o ator?</w:t>
+      </w:r>
+    </w:p>
+    <w:p>
+      <w:pPr/>
+      <w:r>
+        <w:t>Resposta: Cliente (pessoa) e Atendente (pessoa) são atores óbvios; o sistema de pagamento também é um ator, mesmo sendo outro sistema e não uma pessoa — regra prática: ator é quem interage de fora pra dentro do sistema, pessoa ou sistema externo, tanto faz.</w:t>
+      </w:r>
+    </w:p>
+    <w:p>
+      <w:pPr>
+        <w:pStyle w:val="Ttulo2"/>
+      </w:pPr>
+      <w:r>
         <w:t>3.4 Prévia da Aula 4: elementos do Diagrama de Casos de Uso</w:t>
       </w:r>
     </w:p>
@@ -1085,7 +1635,7 @@
     <w:p>
       <w:pPr/>
       <w:r>
-        <w:t>Vamos desenhar isso de verdade, com o cenário TechBurger, na Aula 4.</w:t>
+        <w:t>Hoje já vamos desenhar uma versão simples disso (seção 5.2, TechBurger) e treinar sozinhos (seção 5.5, Biblioteca) — o aprofundamento com Include/Extend fica pra Aula 4.</w:t>
       </w:r>
     </w:p>
     <w:p>
@@ -1093,6 +1643,58 @@
         <w:pStyle w:val="Ttulo2"/>
       </w:pPr>
       <w:r>
+        <w:t>3.4.1 Atividade: Diagrama Humano</w:t>
+      </w:r>
+    </w:p>
+    <w:p>
+      <w:pPr/>
+      <w:r>
+        <w:t>Antes de ir para o computador, vamos montar um Diagrama de Casos de Uso com o próprio corpo da turma — uma forma rápida de sentir a regra prática (ator fora, caso de uso dentro) antes de desenhar.</w:t>
+      </w:r>
+    </w:p>
+    <w:p>
+      <w:pPr>
+        <w:pStyle w:val="Commarcadores"/>
+      </w:pPr>
+      <w:r>
+        <w:t>O professor marca uma fronteira no chão (fita crepe, corda ou o corredor entre as fileiras) representando o retângulo do sistema.</w:t>
+      </w:r>
+    </w:p>
+    <w:p>
+      <w:pPr>
+        <w:pStyle w:val="Commarcadores"/>
+      </w:pPr>
+      <w:r>
+        <w:t>Voluntários viram Atores e ficam FORA da fronteira; outros viram Casos de Uso e ficam DENTRO, dizendo em voz alta a ação que representam (“Fazer Pedido”, “Pagar Pedido”, “Preparar Pedido”).</w:t>
+      </w:r>
+    </w:p>
+    <w:p>
+      <w:pPr>
+        <w:pStyle w:val="Commarcadores"/>
+      </w:pPr>
+      <w:r>
+        <w:t>A turma ajuda a “desenhar” as ligações (um barbante, ou só apontando) entre cada ator e o caso de uso que ele realiza.</w:t>
+      </w:r>
+    </w:p>
+    <w:p>
+      <w:pPr>
+        <w:pStyle w:val="Commarcadores"/>
+      </w:pPr>
+      <w:r>
+        <w:t>Rodada de erro proposital: o professor move alguém pro lado errado da fronteira e a turma aponta o erro, usando a regra prática.</w:t>
+      </w:r>
+    </w:p>
+    <w:p>
+      <w:pPr/>
+      <w:r>
+        <w:t>Fechamento: o que a turma acabou de fazer com o corpo é exatamente o que o draw.io representa com bonecos e elipses — próximo passo, na tela.</w:t>
+      </w:r>
+    </w:p>
+    <w:p>
+      <w:pPr>
+        <w:pStyle w:val="Ttulo2"/>
+      </w:pPr>
+      <w:r>
         <w:t>3.5 Como escolher o diagrama certo</w:t>
       </w:r>
     </w:p>
@@ -1107,6 +1709,20 @@
         <w:pStyle w:val="Ttulo2"/>
       </w:pPr>
       <w:r>
+        <w:t>Erro comum na escolha do diagrama</w:t>
+      </w:r>
+    </w:p>
+    <w:p>
+      <w:pPr/>
+      <w:r>
+        <w:t>Cenário: “o app manda o pedido pro sistema de pagamento, que responde aprovando ou recusando”. Erro comum: desenhar isso como Diagrama de Atividades (processo interno). Por quê é erro: são dois sistemas diferentes trocando mensagens — isso é conversa entre objetos/sistemas, não um processo interno de um só. Escolha certa: Diagrama de Sequência (Aula 8).</w:t>
+      </w:r>
+    </w:p>
+    <w:p>
+      <w:pPr>
+        <w:pStyle w:val="Ttulo2"/>
+      </w:pPr>
+      <w:r>
         <w:t>3.6 Quiz relâmpago: qual diagrama usar?</w:t>
       </w:r>
     </w:p>
@@ -1162,6 +1778,22 @@
       </w:pPr>
       <w:r>
         <w:t>6. Mostrar o Cliente escolhendo o cardápio e fazendo o pedido no app.</w:t>
+      </w:r>
+    </w:p>
+    <w:p>
+      <w:pPr>
+        <w:pStyle w:val="Numerada"/>
+      </w:pPr>
+      <w:r>
+        <w:t>7. Mostrar como os componentes do sistema estão distribuídos em servidores diferentes.</w:t>
+      </w:r>
+    </w:p>
+    <w:p>
+      <w:pPr>
+        <w:pStyle w:val="Numerada"/>
+      </w:pPr>
+      <w:r>
+        <w:t>8. Mostrar um Pedido específico, já com valores reais preenchidos nos atributos.</w:t>
       </w:r>
     </w:p>
     <w:p>
@@ -1388,6 +2020,54 @@
         <w:pStyle w:val="Ttulo2"/>
       </w:pPr>
       <w:r>
+        <w:t>Quando usar qual ferramenta</w:t>
+      </w:r>
+    </w:p>
+    <w:p>
+      <w:pPr>
+        <w:pStyle w:val="Commarcadores"/>
+      </w:pPr>
+      <w:r>
+        <w:t>Quer algo rápido e gratuito, sem instalar nada → draw.io.</w:t>
+      </w:r>
+    </w:p>
+    <w:p>
+      <w:pPr>
+        <w:pStyle w:val="Commarcadores"/>
+      </w:pPr>
+      <w:r>
+        <w:t>Precisa que a notação UML esteja sempre 100% correta → StarUML / Astah.</w:t>
+      </w:r>
+    </w:p>
+    <w:p>
+      <w:pPr>
+        <w:pStyle w:val="Commarcadores"/>
+      </w:pPr>
+      <w:r>
+        <w:t>O time inteiro precisa editar o mesmo diagrama ao vivo → Lucidchart.</w:t>
+      </w:r>
+    </w:p>
+    <w:p>
+      <w:pPr>
+        <w:pStyle w:val="Commarcadores"/>
+      </w:pPr>
+      <w:r>
+        <w:t>Quer versionar o diagrama como código, junto com o projeto → PlantUML.</w:t>
+      </w:r>
+    </w:p>
+    <w:p>
+      <w:pPr>
+        <w:pStyle w:val="Commarcadores"/>
+      </w:pPr>
+      <w:r>
+        <w:t>Nesta disciplina usamos draw.io — mas a lógica de escolha vale pro mercado também.</w:t>
+      </w:r>
+    </w:p>
+    <w:p>
+      <w:pPr>
+        <w:pStyle w:val="Ttulo2"/>
+      </w:pPr>
+      <w:r>
         <w:t>4.2 Caça ao tesouro no draw.io</w:t>
       </w:r>
     </w:p>
@@ -1413,6 +2093,46 @@
       </w:pPr>
       <w:r>
         <w:t>Terminou antes? Ache também o símbolo de «extend» (ponto de extensão).</w:t>
+      </w:r>
+    </w:p>
+    <w:p>
+      <w:pPr>
+        <w:pStyle w:val="Ttulo2"/>
+      </w:pPr>
+      <w:r>
+        <w:t>draw.io: atalhos úteis</w:t>
+      </w:r>
+    </w:p>
+    <w:p>
+      <w:pPr>
+        <w:pStyle w:val="Commarcadores"/>
+      </w:pPr>
+      <w:r>
+        <w:t>Ctrl+Shift+H — ajusta o zoom pra ver o diagrama inteiro na tela.</w:t>
+      </w:r>
+    </w:p>
+    <w:p>
+      <w:pPr>
+        <w:pStyle w:val="Commarcadores"/>
+      </w:pPr>
+      <w:r>
+        <w:t>Ctrl+D — duplica a forma selecionada (útil pra repetir várias elipses de Casos de Uso).</w:t>
+      </w:r>
+    </w:p>
+    <w:p>
+      <w:pPr>
+        <w:pStyle w:val="Commarcadores"/>
+      </w:pPr>
+      <w:r>
+        <w:t>Ctrl+Shift+V — cola só o estilo de uma forma em outra.</w:t>
+      </w:r>
+    </w:p>
+    <w:p>
+      <w:pPr>
+        <w:pStyle w:val="Commarcadores"/>
+      </w:pPr>
+      <w:r>
+        <w:t>Segurar Shift ao arrastar uma seta — mantém a linha reta.</w:t>
       </w:r>
     </w:p>
     <w:p>
@@ -1482,6 +2202,46 @@
       </w:pPr>
       <w:r>
         <w:t>Resultado esperado: fluxograma do pedido do TechBurger.</w:t>
+      </w:r>
+    </w:p>
+    <w:p>
+      <w:pPr>
+        <w:pStyle w:val="Ttulo2"/>
+      </w:pPr>
+      <w:r>
+        <w:t>Erros comuns no draw.io</w:t>
+      </w:r>
+    </w:p>
+    <w:p>
+      <w:pPr>
+        <w:pStyle w:val="Commarcadores"/>
+      </w:pPr>
+      <w:r>
+        <w:t>Forma “flutuando”: parece conectada, mas a seta só está por cima, sem virar vértice de verdade — mova a forma pra testar.</w:t>
+      </w:r>
+    </w:p>
+    <w:p>
+      <w:pPr>
+        <w:pStyle w:val="Commarcadores"/>
+      </w:pPr>
+      <w:r>
+        <w:t>Esquecer de salvar (Ctrl+S) antes de fechar a aba.</w:t>
+      </w:r>
+    </w:p>
+    <w:p>
+      <w:pPr>
+        <w:pStyle w:val="Commarcadores"/>
+      </w:pPr>
+      <w:r>
+        <w:t>Nomear caso de uso sem verbo no infinitivo (“Pedido” em vez de “Fazer Pedido”).</w:t>
+      </w:r>
+    </w:p>
+    <w:p>
+      <w:pPr>
+        <w:pStyle w:val="Commarcadores"/>
+      </w:pPr>
+      <w:r>
+        <w:t>Dica de conferência: arrastem uma forma conectada — se a seta se mover junto, está conectada de verdade.</w:t>
       </w:r>
     </w:p>
     <w:p>
@@ -1899,6 +2659,74 @@
           <w:p/>
         </w:tc>
       </w:tr>
+      <w:tr>
+        <w:tc>
+          <w:tcPr>
+            <w:tcW w:type="dxa" w:w="567"/>
+          </w:tcPr>
+          <w:p>
+            <w:r>
+              <w:t>7</w:t>
+            </w:r>
+          </w:p>
+        </w:tc>
+        <w:tc>
+          <w:tcPr>
+            <w:tcW w:type="dxa" w:w="4535"/>
+          </w:tcPr>
+          <w:p>
+            <w:r>
+              <w:t>Um diagrama mostra um Pedido no estado “Pendente” virando “Pago” quando o pagamento é confirmado.</w:t>
+            </w:r>
+          </w:p>
+        </w:tc>
+        <w:tc>
+          <w:tcPr>
+            <w:tcW w:type="dxa" w:w="2911"/>
+          </w:tcPr>
+          <w:p/>
+        </w:tc>
+        <w:tc>
+          <w:tcPr>
+            <w:tcW w:type="dxa" w:w="1701"/>
+          </w:tcPr>
+          <w:p/>
+        </w:tc>
+      </w:tr>
+      <w:tr>
+        <w:tc>
+          <w:tcPr>
+            <w:tcW w:type="dxa" w:w="567"/>
+          </w:tcPr>
+          <w:p>
+            <w:r>
+              <w:t>8</w:t>
+            </w:r>
+          </w:p>
+        </w:tc>
+        <w:tc>
+          <w:tcPr>
+            <w:tcW w:type="dxa" w:w="4535"/>
+          </w:tcPr>
+          <w:p>
+            <w:r>
+              <w:t>Um diagrama mostra o app mobile, a API e o banco de dados como blocos separados, indicando como o sistema se divide em partes.</w:t>
+            </w:r>
+          </w:p>
+        </w:tc>
+        <w:tc>
+          <w:tcPr>
+            <w:tcW w:type="dxa" w:w="2911"/>
+          </w:tcPr>
+          <w:p/>
+        </w:tc>
+        <w:tc>
+          <w:tcPr>
+            <w:tcW w:type="dxa" w:w="1701"/>
+          </w:tcPr>
+          <w:p/>
+        </w:tc>
+      </w:tr>
     </w:tbl>
     <w:p/>
     <w:p>
@@ -2053,6 +2881,20 @@
         <w:pStyle w:val="Ttulo2"/>
       </w:pPr>
       <w:r>
+        <w:t>Erros comuns ao modelar: e no seu Projeto Integrador?</w:t>
+      </w:r>
+    </w:p>
+    <w:p>
+      <w:pPr/>
+      <w:r>
+        <w:t>Nas Aulas 16 a 19 vocês vão modelar um sistema próprio, do zero, em grupo. Os mesmos erros desta seção valem lá: modelar demais, modelar de menos, diagrama desatualizado, notação inventada, não validar com o grupo. Comecem já a prestar atenção: qual desses erros o seu grupo tem mais tendência a cometer?</w:t>
+      </w:r>
+    </w:p>
+    <w:p>
+      <w:pPr>
+        <w:pStyle w:val="Ttulo2"/>
+      </w:pPr>
+      <w:r>
         <w:t>6.2 Encontre o erro</w:t>
       </w:r>
     </w:p>
@@ -2066,6 +2908,20 @@
       <w:pPr/>
       <w:r>
         <w:t>Em dupla: qual erro comum (seção 6.1) esse cenário representa? O que vocês fariam diferente daqui pra frente? Tempo: 5 minutos.</w:t>
+      </w:r>
+    </w:p>
+    <w:p>
+      <w:pPr>
+        <w:pStyle w:val="Ttulo2"/>
+      </w:pPr>
+      <w:r>
+        <w:t>Mais um cenário: encontre o erro 2</w:t>
+      </w:r>
+    </w:p>
+    <w:p>
+      <w:pPr/>
+      <w:r>
+        <w:t>Um grupo entregou um Diagrama de Classes gigante, com 30 classes e todos os atributos possíveis, “pra não faltar nada”. Ninguém do grupo consegue explicar o diagrama de cabeça — precisam consultar o arquivo pra responder qualquer pergunta sobre ele. Qual erro comum é esse? O que o grupo deveria ter feito diferente?</w:t>
       </w:r>
     </w:p>
     <w:p>
@@ -2475,6 +3331,46 @@
       </w:pPr>
       <w:r>
         <w:t>10. Cite uma vantagem de desenhar diagramas em uma ferramenta (como draw.io) em vez de fazer à mão no papel.</w:t>
+      </w:r>
+    </w:p>
+    <w:p>
+      <w:pPr>
+        <w:pStyle w:val="Ttulo2"/>
+      </w:pPr>
+      <w:r>
+        <w:t>Fechamento: seu checklist pessoal de modelagem</w:t>
+      </w:r>
+    </w:p>
+    <w:p>
+      <w:pPr>
+        <w:pStyle w:val="Commarcadores"/>
+      </w:pPr>
+      <w:r>
+        <w:t>Antes de desenhar: já sei se é uma COISA (estrutura) ou uma AÇÃO (comportamento)?</w:t>
+      </w:r>
+    </w:p>
+    <w:p>
+      <w:pPr>
+        <w:pStyle w:val="Commarcadores"/>
+      </w:pPr>
+      <w:r>
+        <w:t>Durante: meu modelo tem abstração, clareza, consistência e o nível de detalhe certo pro público?</w:t>
+      </w:r>
+    </w:p>
+    <w:p>
+      <w:pPr>
+        <w:pStyle w:val="Commarcadores"/>
+      </w:pPr>
+      <w:r>
+        <w:t>Depois: alguém que não sou eu consegue entender esse diagrama sem eu explicar?</w:t>
+      </w:r>
+    </w:p>
+    <w:p>
+      <w:pPr>
+        <w:pStyle w:val="Commarcadores"/>
+      </w:pPr>
+      <w:r>
+        <w:t>Sempre: esse diagrama ainda representa o sistema real, ou já ficou desatualizado?</w:t>
       </w:r>
     </w:p>
     <w:sectPr>

</xml_diff>